<commit_message>
edit pipeline file, add output file
</commit_message>
<xml_diff>
--- a/프로젝트02_파이프라인_v2.docx
+++ b/프로젝트02_파이프라인_v2.docx
@@ -124,7 +124,7 @@
         <w:rPr>
           <w:rFonts w:hint="eastAsia"/>
         </w:rPr>
-        <w:t>출처 민원 링 크 연결</w:t>
+        <w:t>출처 민원 링크 연결</w:t>
       </w:r>
     </w:p>
     <w:p>
@@ -441,7 +441,7 @@
       <w:pPr>
         <w:pStyle w:val="a6"/>
         <w:numPr>
-          <w:ilvl w:val="1"/>
+          <w:ilvl w:val="2"/>
           <w:numId w:val="3"/>
         </w:numPr>
       </w:pPr>
@@ -453,7 +453,7 @@
       <w:pPr>
         <w:pStyle w:val="a6"/>
         <w:numPr>
-          <w:ilvl w:val="1"/>
+          <w:ilvl w:val="2"/>
           <w:numId w:val="3"/>
         </w:numPr>
       </w:pPr>
@@ -471,7 +471,7 @@
       <w:pPr>
         <w:pStyle w:val="a6"/>
         <w:numPr>
-          <w:ilvl w:val="1"/>
+          <w:ilvl w:val="2"/>
           <w:numId w:val="3"/>
         </w:numPr>
       </w:pPr>
@@ -824,7 +824,6 @@
     <w:p>
       <w:pPr>
         <w:rPr>
-          <w:rFonts w:hint="eastAsia"/>
           <w:b/>
           <w:bCs/>
         </w:rPr>
@@ -833,6 +832,7 @@
         <w:rPr>
           <w:b/>
           <w:bCs/>
+          <w:noProof/>
         </w:rPr>
         <w:drawing>
           <wp:inline distT="0" distB="0" distL="0" distR="0" wp14:anchorId="58ABCD3F" wp14:editId="74867F5C">
@@ -1363,19 +1363,7 @@
         <w:rPr>
           <w:rFonts w:hint="eastAsia"/>
         </w:rPr>
-        <w:t xml:space="preserve">- 제목만 vs </w:t>
-      </w:r>
-      <w:r>
-        <w:rPr>
-          <w:rFonts w:hint="eastAsia"/>
-        </w:rPr>
-        <w:t>제목 + 업무</w:t>
-      </w:r>
-      <w:r>
-        <w:rPr>
-          <w:rFonts w:hint="eastAsia"/>
-        </w:rPr>
-        <w:t xml:space="preserve"> vs 제목 + 업무 + 소제목</w:t>
+        <w:t>- 제목만 vs 제목 + 업무 vs 제목 + 업무 + 소제목</w:t>
       </w:r>
     </w:p>
     <w:sectPr>

</xml_diff>